<commit_message>
docs: update namespace naming conventions in assignment 3 documentation
</commit_message>
<xml_diff>
--- a/context/Advanced Topics TAU 2026B - Assignment 3.docx
+++ b/context/Advanced Topics TAU 2026B - Assignment 3.docx
@@ -694,7 +694,7 @@
           <w:rFonts w:ascii="Courier New" w:cs="Courier New" w:eastAsia="Courier New" w:hAnsi="Courier New"/>
           <w:rtl w:val="0"/>
         </w:rPr>
-        <w:t xml:space="preserve">Algorithm_098765432_123456789</w:t>
+        <w:t xml:space="preserve">algorithm_098765432_123456789</w:t>
       </w:r>
       <w:r>
         <w:rPr>
@@ -756,7 +756,7 @@
           <w:rFonts w:ascii="Courier New" w:cs="Courier New" w:eastAsia="Courier New" w:hAnsi="Courier New"/>
           <w:rtl w:val="0"/>
         </w:rPr>
-        <w:t xml:space="preserve">MissionControl_098765432_123456789</w:t>
+        <w:t xml:space="preserve">mission_control_098765432_123456789</w:t>
       </w:r>
       <w:r>
         <w:rPr>
@@ -829,7 +829,7 @@
           <w:rFonts w:ascii="Courier New" w:cs="Courier New" w:eastAsia="Courier New" w:hAnsi="Courier New"/>
           <w:rtl w:val="0"/>
         </w:rPr>
-        <w:t xml:space="preserve">UserCommon_098765432_123456789</w:t>
+        <w:t xml:space="preserve">user_common_098765432_123456789</w:t>
       </w:r>
       <w:r>
         <w:rPr>

</xml_diff>

<commit_message>
docs: update namespace naming conventions in assignment 3 documentation for Algorithm and UserCommon folders
</commit_message>
<xml_diff>
--- a/context/Advanced Topics TAU 2026B - Assignment 3.docx
+++ b/context/Advanced Topics TAU 2026B - Assignment 3.docx
@@ -694,7 +694,7 @@
           <w:rFonts w:ascii="Courier New" w:cs="Courier New" w:eastAsia="Courier New" w:hAnsi="Courier New"/>
           <w:rtl w:val="0"/>
         </w:rPr>
-        <w:t xml:space="preserve">Algorithm_098765432_123456789</w:t>
+        <w:t xml:space="preserve">algorithm_098765432_123456789</w:t>
       </w:r>
       <w:r>
         <w:rPr>
@@ -756,7 +756,7 @@
           <w:rFonts w:ascii="Courier New" w:cs="Courier New" w:eastAsia="Courier New" w:hAnsi="Courier New"/>
           <w:rtl w:val="0"/>
         </w:rPr>
-        <w:t xml:space="preserve">MissionControl_098765432_123456789</w:t>
+        <w:t xml:space="preserve">mission_control_098765432_123456789</w:t>
       </w:r>
       <w:r>
         <w:rPr>
@@ -829,7 +829,7 @@
           <w:rFonts w:ascii="Courier New" w:cs="Courier New" w:eastAsia="Courier New" w:hAnsi="Courier New"/>
           <w:rtl w:val="0"/>
         </w:rPr>
-        <w:t xml:space="preserve">UserCommon_098765432_123456789</w:t>
+        <w:t xml:space="preserve">user_common_098765432_123456789</w:t>
       </w:r>
       <w:r>
         <w:rPr>

</xml_diff>